<commit_message>
Add catalog accumulation validation
</commit_message>
<xml_diff>
--- a/manuscript/Scientific_Reports_submission_manuscript.docx
+++ b/manuscript/Scientific_Reports_submission_manuscript.docx
@@ -889,16 +889,7 @@
         <w:jc w:val="left"/>
       </w:pPr>
       <w:r>
-        <w:rPr>
-          <w:rFonts w:ascii="Arial" w:hAnsi="Arial"/>
-        </w:rPr>
-        <w:t>We added a 500 replicate resampling analysis using the released panel and membership table. In stratified samples retaining 80 percent of each lineage, all 250 families were detected at least once in every replicate; a median of 212 retained membership in at least five sampled genomes (95 percent interval 204 to 220). When all rare groups were retained and the two capped groups were reduced to 80 percent, all families were again detected and a median of 224 retained five genomes (218 to 231). A deliberately smaller panel capped every major group at 30 genomes, producing 157 genomes, recovered a median of 242 families at least once (235 to 247) and 137 at five genomes (127 to 148). The analysis supports the robustness of catalog detection to moderate within panel resampling, while showing that the five genome inclusion rule is sensitive to panel size. It cannot substitute for full rediscovery from alternative draws of the unreleased 1,069 genome candidate pool.</w:t>
-      </w:r>
-      <w:r>
-        <w:rPr>
-          <w:rFonts w:ascii="Arial" w:hAnsi="Arial"/>
-        </w:rPr>
-        <w:t xml:space="preserve"> (Supplementary Fig. S1).</w:t>
+        <w:t>We added a 500 replicate resampling analysis using the released panel and membership table. In stratified samples retaining 80 percent of each lineage, all 250 families were detected at least once in every replicate; a median of 212 retained membership in at least five sampled genomes (95 percent interval 204 to 220). When all rare groups were retained and the two capped groups were reduced to 80 percent, all families were again detected and a median of 224 retained five genomes (218 to 231). A deliberately smaller panel capped every major group at 30 genomes, producing 157 genomes, recovered a median of 242 families at least once (235 to 247) and 137 at five genomes (127 to 148). A separate lineage-stratified accumulation analysis showed that a median of 249 families was observable in half-panel samples of 167 genomes (95 percent interval 245 to 250), whereas only 156 met the five-genome rule (146 to 165). All 250 families were observed in every 80 percent sample, but only a median of 213 met the five-genome rule (203 to 220). These fixed-catalog analyses show that family observation approaches saturation before the abundance-based eligibility criterion. They cannot substitute for full rediscovery from alternative draws of the unreleased 1,069 genome candidate pool (Supplementary Fig. S10).</w:t>
       </w:r>
     </w:p>
     <w:p>
@@ -1481,10 +1472,7 @@
         <w:jc w:val="left"/>
       </w:pPr>
       <w:r>
-        <w:rPr>
-          <w:rFonts w:ascii="Arial" w:hAnsi="Arial"/>
-        </w:rPr>
-        <w:t>The 331 genome panel is the deterministic output of a lineage balancing rule, except for the seeded proportional samples within the two capped groups. Its purpose is to prevent heavily sequenced clades from dominating family discovery while retaining all genomes from five underrepresented groups. The particular caps remain pragmatic. Within panel resampling shows that moderate reductions preserve detection of every family, but smaller panels disproportionately remove families near the five genome threshold. Independent projection samples recovered a median of 245 families, showing that most profiles transfer beyond the discovery accessions. A stronger future test should rerun the complete scan and clustering workflow on alternative panels drawn from the full candidate pool and quantify family matching across runs.</w:t>
+        <w:t>The 331 genome panel is the deterministic output of a lineage balancing rule, except for the seeded proportional samples within the two capped groups. Its purpose is to prevent heavily sequenced clades from dominating family discovery while retaining all genomes from five underrepresented groups. The particular caps remain pragmatic. Within-panel resampling and the accumulation curve show that moderate reductions preserve observation of nearly every fixed family, but smaller panels disproportionately remove families near the five-genome threshold. Independent projection samples recovered a median of 245 families, showing that most profiles transfer beyond the discovery accessions. A stronger future test should rerun the complete scan and clustering workflow on alternative panels drawn from the full candidate pool and quantify family matching across runs.</w:t>
       </w:r>
     </w:p>
     <w:p>
@@ -1578,10 +1566,7 @@
         <w:jc w:val="left"/>
       </w:pPr>
       <w:r>
-        <w:rPr>
-          <w:rFonts w:ascii="Arial" w:hAnsi="Arial"/>
-        </w:rPr>
-        <w:t>This computational comparative-genomics study had a primary descriptive objective: construct a bounded family catalog within Pfam clans CL0123 and CL0057 after excluding a predefined nineteen-family reference set. Held-out assignment and independent-genome projection were confirmatory validation analyses. Panel resampling, genome-quality stratification, clustered prevalence, taxonomically blocked motif tests and the ten-family sequence check were sensitivity analyses. No biological effect-size or power calculation was applicable to deterministic catalog construction; resampling counts and random seeds are reported for all stochastic analyses. Supplementary Table S1 lists each analysis and its permitted interpretation, and Supplementary Fig. S6 summarizes the workflow.</w:t>
+        <w:t>This computational comparative-genomics study had a primary descriptive objective: construct a bounded family catalog within Pfam clans CL0123 and CL0057 after excluding a predefined nineteen-family reference set. Held-out assignment and independent-genome projection were confirmatory validation analyses. Panel resampling, catalog accumulation, genome-quality stratification, clustered prevalence, taxonomically blocked motif tests and the ten-family sequence check were sensitivity analyses. No biological effect-size or power calculation was applicable to deterministic catalog construction; resampling counts and random seeds are reported for all stochastic analyses. Supplementary Table S1 lists each analysis and its permitted interpretation, and Supplementary Fig. S6 summarizes the workflow.</w:t>
       </w:r>
     </w:p>
     <w:p>
@@ -1672,16 +1657,7 @@
         <w:jc w:val="left"/>
       </w:pPr>
       <w:r>
-        <w:rPr>
-          <w:rFonts w:ascii="Arial" w:hAnsi="Arial"/>
-        </w:rPr>
-        <w:t>For the new panel sensitivity analysis, genomes were resampled without replacement for 500 replicates under three schemes: 80 percent of every lineage; all rare lineages plus 112 Euryarchaeota and 56 Crenarchaeota; and a maximum of 30 genomes per lineage. For every replicate we counted catalog families detected at least once and families retaining at least five genomes. This analysis uses fixed released family memberships and therefore measures catalog retention, not de novo rediscovery.</w:t>
-      </w:r>
-      <w:r>
-        <w:rPr>
-          <w:rFonts w:ascii="Arial" w:hAnsi="Arial"/>
-        </w:rPr>
-        <w:t xml:space="preserve"> (Supplementary Fig. S1).</w:t>
+        <w:t>For the new panel sensitivity analysis, genomes were resampled without replacement for 500 replicates under three schemes: 80 percent of every lineage; all rare lineages plus 112 Euryarchaeota and 56 Crenarchaeota; and a maximum of 30 genomes per lineage. We also sampled 10 to 100 percent of each lineage in 10 percent increments, with 500 replicates below the complete panel, to construct a catalog accumulation curve. For every replicate we counted catalog families detected at least once and families retaining at least five genomes. These analyses use fixed released family memberships and therefore measure catalog observation and retention, not de novo rediscovery (Supplementary Figs. S1 and S10).</w:t>
       </w:r>
     </w:p>
     <w:p>

</xml_diff>

<commit_message>
Prepare Scientific Reports submission and complete sequence release
</commit_message>
<xml_diff>
--- a/manuscript/Scientific_Reports_submission_manuscript.docx
+++ b/manuscript/Scientific_Reports_submission_manuscript.docx
@@ -852,7 +852,7 @@
         <w:rPr>
           <w:rFonts w:ascii="Arial" w:hAnsi="Arial"/>
         </w:rPr>
-        <w:t>The noncanonical proteins were clustered with MMseqs2 at 30 percent sequence identity and 60 percent coverage. We retained clusters with a median protein length below 250 amino acids, at least 60 percent of members below 250 amino acids, and occurrence in at least five panel genomes, then removed clusters carrying keywords associated with clearly nonregulatory functions. This produced 250 candidate families, nArcR 1 through nArcR 250, comprising 13,237 proteins. Of the families, 171 have a characterized domain outside the reference set and 79 were uncharacterized by Pfam. Accordingly, the main novelty is the family level organization and archaeal distribution of noncanonical clan members, not 250 newly discovered DNA-binding folds.</w:t>
+        <w:t>The noncanonical proteins were clustered with MMseqs2 at 30 percent sequence identity and 60 percent coverage. We retained clusters with a median protein length below 250 amino acids, at least 60 percent of members below 250 amino acids, and occurrence in at least five panel genomes, then removed clusters carrying keywords associated with clearly nonregulatory functions. This produced 250 candidate families, nArcR-1 through nArcR-250, comprising 13,237 proteins. Of the families, 171 have a characterized domain outside the reference set and 79 were uncharacterized by Pfam. Accordingly, the main novelty is the family level organization and archaeal distribution of noncanonical clan members, not 250 newly discovered DNA-binding folds.</w:t>
       </w:r>
     </w:p>
     <w:p>
@@ -889,7 +889,16 @@
         <w:jc w:val="left"/>
       </w:pPr>
       <w:r>
-        <w:t>We added a 500 replicate resampling analysis using the released panel and membership table. In stratified samples retaining 80 percent of each lineage, all 250 families were detected at least once in every replicate; a median of 212 retained membership in at least five sampled genomes (95 percent interval 204 to 220). When all rare groups were retained and the two capped groups were reduced to 80 percent, all families were again detected and a median of 224 retained five genomes (218 to 231). A deliberately smaller panel capped every major group at 30 genomes, producing 157 genomes, recovered a median of 242 families at least once (235 to 247) and 137 at five genomes (127 to 148). A separate lineage-stratified accumulation analysis showed that a median of 249 families was observable in half-panel samples of 167 genomes (95 percent interval 245 to 250), whereas only 156 met the five-genome rule (146 to 165). All 250 families were observed in every 80 percent sample, but only a median of 213 met the five-genome rule (203 to 220). These fixed-catalog analyses show that family observation approaches saturation before the abundance-based eligibility criterion. They cannot substitute for full rediscovery from alternative draws of the unreleased 1,069 genome candidate pool (Supplementary Fig. S10).</w:t>
+        <w:rPr>
+          <w:rFonts w:ascii="Arial" w:hAnsi="Arial"/>
+        </w:rPr>
+        <w:t>We added a 500 replicate resampling analysis using the released panel and membership table. In stratified samples retaining 80 percent of each lineage, all 250 families were detected at least once in every replicate; a median of 212 retained membership in at least five sampled genomes (95 percent interval 204 to 220). When all rare groups were retained and the two capped groups were reduced to 80 percent, all families were again detected and a median of 224 retained five genomes (218 to 231). A deliberately smaller panel capped every major group at 30 genomes, producing 157 genomes, recovered a median of 242 families at least once (235 to 247) and 137 at five genomes (127 to 148). The analysis supports the robustness of catalog detection to moderate within panel resampling, while showing that the five genome inclusion rule is sensitive to panel size. It cannot substitute for full rediscovery from alternative draws of the unreleased 1,069 genome candidate pool.</w:t>
+      </w:r>
+      <w:r>
+        <w:rPr>
+          <w:rFonts w:ascii="Arial" w:hAnsi="Arial"/>
+        </w:rPr>
+        <w:t xml:space="preserve"> (Supplementary Fig. S1).</w:t>
       </w:r>
     </w:p>
     <w:p>
@@ -985,13 +994,7 @@
         <w:rPr>
           <w:rFonts w:ascii="Arial" w:hAnsi="Arial"/>
         </w:rPr>
-        <w:t>The only released protein-sequence collection suitable for an additional boundary check contains 782 sequences from ten phylogenetic example families. In leave-one-sequence-out classification using dipeptide-composition centroids, family-specific accuracies ranged from 0.775 to 0.963. This alignment-free result supports compositional separability in that subset only; it does not validate the remaining 240 family boundaries.</w:t>
-      </w:r>
-      <w:r>
-        <w:rPr>
-          <w:rFonts w:ascii="Arial" w:hAnsi="Arial"/>
-        </w:rPr>
-        <w:t xml:space="preserve"> (Supplementary Fig. S8).</w:t>
+        <w:t>A prespecified 782-sequence subset spanning ten phylogenetic example families was used for an additional alignment-free boundary check. In leave-one-sequence-out classification using dipeptide-composition centroids, family-specific accuracies ranged from 0.775 to 0.963. This result supports compositional separability in that subset only; it does not validate the remaining 240 family boundaries. The complete 13,237-member sequence collection is now deposited for future catalog-wide clade-blocked validation. (Supplementary Fig. S8).</w:t>
       </w:r>
     </w:p>
     <w:p>
@@ -1200,7 +1203,7 @@
         <w:rPr>
           <w:rFonts w:ascii="Arial" w:hAnsi="Arial"/>
         </w:rPr>
-        <w:t>An initial genome shuffled enrichment screen found at least one neighboring category for 178 families. The most frequent top categories included toxin antitoxin systems, HalOD1 type signaling, DNA repair and replication, transport, oxidoreductases, methyltransferases, and metallohydrolases. A stricter genus collapsed and whole neighborhood block permutation analysis was used to reduce phylogenetic nonindependence and locus pseudoreplication. Strong associations for nArcR 10, 13, 20, 28, and 50 near toxin antitoxin loci; nArcR 107 near CRISPR and defense loci; nArcR 9 near peptidase and kinase genes; and nArcR 2 near HalOD1 signaling survived at the empirical permutation floor. Other associations weakened under the dependence aware analysis.</w:t>
+        <w:t>An initial genome-shuffled enrichment screen identified at least one neighboring category for 178 families. The most frequent top categories included toxin-antitoxin systems, HalOD1-type signaling, DNA repair and replication, transport, oxidoreductases, methyltransferases and metallohydrolases. The historical workflow also reported genus-collapsed and whole-neighborhood block permutations, but their accession-level output table was not preserved. We therefore treat the deposited initial enrichment table and Figure 5 as exploratory and do not present individual associations as dependence-corrected findings.</w:t>
       </w:r>
     </w:p>
     <w:p>
@@ -1213,7 +1216,7 @@
         <w:rPr>
           <w:rFonts w:ascii="Arial" w:hAnsi="Arial"/>
         </w:rPr>
-        <w:t>Upstream motif discovery provides a separate line of evidence. Eleven of twelve tested families produced a motif that exceeded mononucleotide, dinucleotide, and shuffled family assignment nulls after multiple testing correction. nArcR 6 failed the assignment null. In a deeper analysis of six flagship families, motifs derived from regulator upstreams were generally not enriched upstream of their predicted neighboring targets; five of six tests had p greater than 0.5 and nArcR 20 was marginal at p equals 0.04. These negative results rule out a direct regulon claim from the present data. The neighborhood and motif results instead nominate protein families and loci for binding assays and genetic perturbation.</w:t>
+        <w:t>Upstream motif discovery provides a separate line of evidence. Eleven of twelve tested families produced a motif that exceeded mononucleotide, dinucleotide, and shuffled family assignment nulls after multiple testing correction. nArcR-6 failed the assignment null. In a deeper analysis of six flagship families, motifs derived from regulator upstreams were generally not enriched upstream of their predicted neighboring targets; five of six tests had p greater than 0.5 and nArcR-20 was marginal at p equals 0.04. These negative results rule out a direct regulon claim from the present data. The neighborhood and motif results instead nominate protein families and loci for binding assays and genetic perturbation.</w:t>
       </w:r>
     </w:p>
     <w:p>
@@ -1226,13 +1229,7 @@
         <w:rPr>
           <w:rFonts w:ascii="Arial" w:hAnsi="Arial"/>
         </w:rPr>
-        <w:t>We next relearned each motif after splitting genomes into 70 percent training and 30 percent test sets for 30 seeded replicates. All 12 motifs had median held out AUC above 0.5 against dinucleotide shuffled versions of the same sequences. Ten of 12 produced an AUC above 0.5 against GC matched upstreams of other families in at least 26 resamples. nArcR 20 and nArcR 24 did not. The repeated splits overlap, so we report their distributions descriptively rather than treat them as independent observations for hypothesis testing. nArcR 6 showed weak but directionally consistent discrimination from other families (median AUC 0.580), which does not override its failure under the earlier shuffled family assignment null. These results provide out of sample sequence evidence for most tested motifs, but do not demonstrate protein binding or regulation.</w:t>
-      </w:r>
-      <w:r>
-        <w:rPr>
-          <w:rFonts w:ascii="Arial" w:hAnsi="Arial"/>
-        </w:rPr>
-        <w:t xml:space="preserve"> (Supplementary Fig. S3).</w:t>
+        <w:t>We next relearned each motif after splitting genomes into 70 percent training and 30 percent test sets for 30 seeded replicates. All 12 motifs had median held out AUC above 0.5 against dinucleotide shuffled versions of the same sequences. Ten of 12 produced an AUC above 0.5 against GC matched upstreams of other families in at least 26 resamples. nArcR-20 and nArcR-24 did not. The repeated splits overlap, so we report their distributions descriptively rather than treat them as independent observations for hypothesis testing. nArcR-6 showed weak but directionally consistent discrimination from other families (median AUC 0.580), which does not override its failure under the earlier shuffled family assignment null. These results provide out of sample sequence evidence for most tested motifs, but do not demonstrate protein binding or regulation. (Supplementary Fig. S3).</w:t>
       </w:r>
     </w:p>
     <w:p>
@@ -1326,7 +1323,7 @@
           <w:rFonts w:ascii="Arial" w:hAnsi="Arial"/>
           <w:color w:val="000000"/>
         </w:rPr>
-        <w:t>Figure 5. Significant genomic-neighborhood associations for selected catalogued families. Color encodes log2 fold enrichment in the initial deposited table. Associations generate functional hypotheses and do not establish direct transcriptional regulation; dependence-corrected source tables remain a documented deposition gap.</w:t>
+        <w:t>Figure 5. Exploratory genomic-neighborhood associations for selected catalogued families. Color encodes log2 fold enrichment in the initial deposited table. Associations generate functional hypotheses and do not establish direct transcriptional regulation; the historical dependence-corrected source table was not preserved.</w:t>
       </w:r>
     </w:p>
     <w:p>
@@ -1472,7 +1469,10 @@
         <w:jc w:val="left"/>
       </w:pPr>
       <w:r>
-        <w:t>The 331 genome panel is the deterministic output of a lineage balancing rule, except for the seeded proportional samples within the two capped groups. Its purpose is to prevent heavily sequenced clades from dominating family discovery while retaining all genomes from five underrepresented groups. The particular caps remain pragmatic. Within-panel resampling and the accumulation curve show that moderate reductions preserve observation of nearly every fixed family, but smaller panels disproportionately remove families near the five-genome threshold. Independent projection samples recovered a median of 245 families, showing that most profiles transfer beyond the discovery accessions. A stronger future test should rerun the complete scan and clustering workflow on alternative panels drawn from the full candidate pool and quantify family matching across runs.</w:t>
+        <w:rPr>
+          <w:rFonts w:ascii="Arial" w:hAnsi="Arial"/>
+        </w:rPr>
+        <w:t>The 331 genome panel is the deterministic output of a lineage balancing rule, except for the seeded proportional samples within the two capped groups. Its purpose is to prevent heavily sequenced clades from dominating family discovery while retaining all genomes from five underrepresented groups. The particular caps remain pragmatic. Within panel resampling shows that moderate reductions preserve detection of every family, but smaller panels disproportionately remove families near the five genome threshold. Independent projection samples recovered a median of 245 families, showing that most profiles transfer beyond the discovery accessions. A stronger future test should rerun the complete scan and clustering workflow on alternative panels drawn from the full candidate pool and quantify family matching across runs.</w:t>
       </w:r>
     </w:p>
     <w:p>
@@ -1485,7 +1485,7 @@
         <w:rPr>
           <w:rFonts w:ascii="Arial" w:hAnsi="Arial"/>
         </w:rPr>
-        <w:t>The evidence is strongest for family coherence and for the conclusion that most proteins adopt known DNA-binding folds. Genomic context suggests biological settings, but direct regulatory relationships remain unproven. Held out motif prediction strengthens the case that most tested families have recurrent family specific upstream sequence patterns. The negative target enrichment tests and the failures for nArcR 20 and nArcR 24 prevent a direct regulon claim. The phylogenetic analysis of ten families indicates within phylum clustering for eight, which is compatible with vertical inheritance or ancient origin but does not distinguish these mechanisms. The Haloferax volcanii transcriptomic analysis confirms expression for most mapped loci; its oxidative stress comparison is exploratory because the released script uses simple tests on three replicates per condition rather than a count based dispersion model.</w:t>
+        <w:t>The evidence is strongest for family coherence and for the conclusion that most proteins adopt known DNA-binding folds. Genomic context suggests biological settings, but direct regulatory relationships remain unproven. Held out motif prediction strengthens the case that most tested families have recurrent family specific upstream sequence patterns. The negative target enrichment tests and the failures for nArcR-20 and nArcR-24 prevent a direct regulon claim. The phylogenetic analysis of ten families indicates within phylum clustering for eight, which is compatible with vertical inheritance or ancient origin but does not distinguish these mechanisms. The Haloferax volcanii transcriptomic analysis confirms expression for most mapped loci; its oxidative stress comparison is exploratory because the released script uses simple tests on three replicates per condition rather than a count based dispersion model.</w:t>
       </w:r>
     </w:p>
     <w:p>
@@ -1498,7 +1498,7 @@
         <w:rPr>
           <w:rFonts w:ascii="Arial" w:hAnsi="Arial"/>
         </w:rPr>
-        <w:t>The nine families unresolved by both CDD and the curated structural library, together with the strongest dependence corrected neighborhood associations, provide a focused experimental agenda. Electrophoretic mobility shift assays, DNA affinity measurements, knockouts or CRISPR interference, and transcriptome profiling after perturbation would establish which families are transcription factors, their operators, and their direct targets.</w:t>
+        <w:t>The nine families unresolved by both CDD and the curated structural library provide the clearest experimental priorities. Exploratory neighborhood associations can guide locus selection but are not used as dependence-corrected evidence. Electrophoretic mobility shift assays, DNA-affinity measurements, knockouts or CRISPR interference, and transcriptome profiling after perturbation would establish which families are transcription factors, their operators and their direct targets.</w:t>
       </w:r>
     </w:p>
     <w:p>
@@ -1511,13 +1511,7 @@
         <w:rPr>
           <w:rFonts w:ascii="Arial" w:hAnsi="Arial"/>
         </w:rPr>
-        <w:t>First, the search universe is restricted to two Pfam clans. Second, the 5-bit reciprocal exclusion tolerance and the lineage caps lack a full de novo sensitivity analysis because the released archive omits the complete raw candidate and canonical domain hit tables and the 1,069 genome candidate pool. The independent projection analysis tests existing HMMs, not family rediscovery. Third, the final 3,526 genome prevalence summaries are supported by corrected tables, while the released raw matrices contain 3,192 genomes and should be treated as legacy intermediates. Fourth, the dependence corrected neighborhood and deep motif source tables cited in the manuscript are absent from the archive even though their figures are present. Fifth, computational motif prediction cannot replace direct binding assays. These limitations constrain claims of exhaustiveness, regulation, and full raw to figure reproducibility.</w:t>
-      </w:r>
-      <w:r>
-        <w:rPr>
-          <w:rFonts w:ascii="Arial" w:hAnsi="Arial"/>
-        </w:rPr>
-        <w:t xml:space="preserve"> Sixth, source and assembly-quality strata differ in lineage composition, so their prevalence contrasts are descriptive. Seventh, genus- and lineage-blocked motif validation attenuates support for several motifs and confirms that genome-level holdout alone does not eliminate phylogenetic signal. Eighth, the genus-clustered prevalence analysis uses organism-name labels rather than a versioned taxonomy or species tree. Ninth, the additional family-separability check covers only the ten families with released protein sequences.</w:t>
+        <w:t>First, the search universe is restricted to two Pfam clans. Second, the 5-bit reciprocal-exclusion tolerance and lineage caps lack a full de novo sensitivity analysis because the release omits the complete raw candidate and canonical domain-hit tables and the 1,069-genome candidate pool. The independent projection analysis tests existing HMMs rather than family rediscovery. Third, final 3,526-genome prevalence summaries are supported by corrected tables, whereas the released raw matrices contain 3,192 genomes and remain legacy intermediates. Fourth, the historical dependence-corrected neighborhood and deep-motif source tables are absent even though archived figures are preserved; no central claim relies on those missing tables. Fifth, computational motif prediction cannot replace direct binding assays. Sixth, source and assembly-quality strata differ in lineage composition, so prevalence contrasts are descriptive. Seventh, genus- and lineage-blocked motif validation attenuates support for several motifs. Eighth, genus-clustered prevalence uses inferred organism-name labels rather than a versioned taxonomy or species tree. Ninth, the additional family-separability analysis covers ten families; the newly deposited full sequence collection enables a future catalog-wide clade-blocked analysis but was not used retrospectively to redefine the released families.</w:t>
       </w:r>
     </w:p>
     <w:p>
@@ -1566,6 +1560,9 @@
         <w:jc w:val="left"/>
       </w:pPr>
       <w:r>
+        <w:rPr>
+          <w:rFonts w:ascii="Arial" w:hAnsi="Arial"/>
+        </w:rPr>
         <w:t>This computational comparative-genomics study had a primary descriptive objective: construct a bounded family catalog within Pfam clans CL0123 and CL0057 after excluding a predefined nineteen-family reference set. Held-out assignment and independent-genome projection were confirmatory validation analyses. Panel resampling, catalog accumulation, genome-quality stratification, clustered prevalence, taxonomically blocked motif tests and the ten-family sequence check were sensitivity analyses. No biological effect-size or power calculation was applicable to deterministic catalog construction; resampling counts and random seeds are reported for all stochastic analyses. Supplementary Table S1 lists each analysis and its permitted interpretation, and Supplementary Fig. S6 summarizes the workflow.</w:t>
       </w:r>
     </w:p>
@@ -1657,7 +1654,16 @@
         <w:jc w:val="left"/>
       </w:pPr>
       <w:r>
-        <w:t>For the new panel sensitivity analysis, genomes were resampled without replacement for 500 replicates under three schemes: 80 percent of every lineage; all rare lineages plus 112 Euryarchaeota and 56 Crenarchaeota; and a maximum of 30 genomes per lineage. We also sampled 10 to 100 percent of each lineage in 10 percent increments, with 500 replicates below the complete panel, to construct a catalog accumulation curve. For every replicate we counted catalog families detected at least once and families retaining at least five genomes. These analyses use fixed released family memberships and therefore measure catalog observation and retention, not de novo rediscovery (Supplementary Figs. S1 and S10).</w:t>
+        <w:rPr>
+          <w:rFonts w:ascii="Arial" w:hAnsi="Arial"/>
+        </w:rPr>
+        <w:t>For the new panel sensitivity analysis, genomes were resampled without replacement for 500 replicates under three schemes: 80 percent of every lineage; all rare lineages plus 112 Euryarchaeota and 56 Crenarchaeota; and a maximum of 30 genomes per lineage. For every replicate we counted catalog families detected at least once and families retaining at least five genomes. This analysis uses fixed released family memberships and therefore measures catalog retention, not de novo rediscovery.</w:t>
+      </w:r>
+      <w:r>
+        <w:rPr>
+          <w:rFonts w:ascii="Arial" w:hAnsi="Arial"/>
+        </w:rPr>
+        <w:t xml:space="preserve"> (Supplementary Fig. S1).</w:t>
       </w:r>
     </w:p>
     <w:p>
@@ -1697,13 +1703,7 @@
         <w:rPr>
           <w:rFonts w:ascii="Arial" w:hAnsi="Arial"/>
         </w:rPr>
-        <w:t>For the released ten-family sequence subset, each protein was represented by normalized dipeptide frequencies. The sequence was removed from its own family centroid, cosine similarities to all family centroids were calculated, and the highest-scoring family was assigned. Exact binomial 95 percent intervals and the own-family minus nearest-other-family similarity margin were reported. The analysis was not extrapolated beyond the released subset.</w:t>
-      </w:r>
-      <w:r>
-        <w:rPr>
-          <w:rFonts w:ascii="Arial" w:hAnsi="Arial"/>
-        </w:rPr>
-        <w:t xml:space="preserve"> (Supplementary Fig. S8).</w:t>
+        <w:t>For the prespecified ten-family sequence subset, each protein was represented by normalized dipeptide frequencies. The sequence was removed from its own family centroid, cosine similarities to all family centroids were calculated, and the highest-scoring family was assigned. Exact binomial 95 percent intervals and the own-family minus nearest-other-family similarity margin were reported. The analysis was not extrapolated beyond the prespecified subset. (Supplementary Fig. S8).</w:t>
       </w:r>
     </w:p>
     <w:p>
@@ -1716,13 +1716,7 @@
         <w:rPr>
           <w:rFonts w:ascii="Arial" w:hAnsi="Arial"/>
         </w:rPr>
-        <w:t>For independent genome validation, discovery panel accessions were removed from the legacy 3,192 genome presence absence matrix. Five hundred samples were then drawn without replacement using the discovery panel lineage counts: 140 Euryarchaeota, 70 Crenarchaeota and other TACK, 51 Thaumarchaeota, 33 DPANN, 19 Asgardarchaeota, 15 other deep TACK, and 3 Korarchaeota. For each sample we counted families detected at least once and in at least five genomes. The procedure used fixed family HMM projections and therefore measures transferability rather than de novo discovery.</w:t>
-      </w:r>
-      <w:r>
-        <w:rPr>
-          <w:rFonts w:ascii="Arial" w:hAnsi="Arial"/>
-        </w:rPr>
-        <w:t xml:space="preserve"> (Supplementary Fig. S2).</w:t>
+        <w:t>For independent genome validation, discovery panel accessions were removed from the legacy 3,192 genome presence absence matrix. Five hundred samples were then drawn without replacement using the discovery panel lineage counts: 140 Euryarchaeota, 70 Crenarchaeota (TACK), 51 Thaumarchaeota, 33 DPANN, 19 Asgardarchaeota, 15 other deep TACK, and 3 Korarchaeota. For each sample we counted families detected at least once and in at least five genomes. The procedure used fixed family HMM projections and therefore measures transferability rather than de novo discovery. (Supplementary Fig. S2).</w:t>
       </w:r>
     </w:p>
     <w:p>
@@ -1781,7 +1775,7 @@
         <w:rPr>
           <w:rFonts w:ascii="Arial" w:hAnsi="Arial"/>
         </w:rPr>
-        <w:t>Genes within five coding sequences of family members were assigned functional categories. Initial family category enrichment used genome conditioned label sampling, binomial tests, and Benjamini Hochberg correction [35]. Strong links were retested after collapse to one observation per genus and by shuffling whole neighborhood blocks for 2,000 permutations with seed 42. Up to 250 strand aware upstream nucleotides were used for motif discovery under a zero or one occurrence model. Motif information content was tested against mononucleotide shuffle, dinucleotide shuffle, and shuffled family assignment nulls with 100 replicates each and false-discovery-rate control. Six flagship family motifs were additionally assessed with 1,000 permutations and scanned against upstream regions of predicted target genes.</w:t>
+        <w:t>Genes within five coding sequences of family members were assigned functional categories. Initial family-category enrichment used genome-conditioned label sampling, binomial tests and Benjamini-Hochberg correction [35]. The historical workflow described a genus collapse and 2,000 whole-neighborhood block permutations with seed 42, but the resulting source table was not preserved. No individual dependence-corrected association is therefore treated as a reproducible finding. Up to 250 strand-aware upstream nucleotides were used for motif discovery under a zero-or-one occurrence model. Motif information content was tested against mononucleotide-shuffle, dinucleotide-shuffle and shuffled-family-assignment nulls with 100 replicates each and false-discovery-rate control. Six flagship-family motifs were additionally assessed with 1,000 permutations and scanned against upstream regions of predicted target genes.</w:t>
       </w:r>
     </w:p>
     <w:p>
@@ -1949,7 +1943,7 @@
         <w:rPr>
           <w:rFonts w:ascii="Arial" w:hAnsi="Arial"/>
         </w:rPr>
-        <w:t>The deposited datasets and versioned analysis outputs supporting this study are available in the Zenodo repository at https://doi.org/10.5281/zenodo.23461090 [41]. The repository records the distinct 3,192- and 3,526-genome scopes and includes accession-resolved inputs where they were preserved. The complete 1,069-genome candidate pool, raw discovery HMM hit tables, corrected 3,526-genome raw matrices, several dependence-corrected source tables and complete sequences for all 250 families were not present in the supplied source archive and are explicitly listed as unavailable; the corresponding claims are limited accordingly. Third-party database records remain subject to their source terms.</w:t>
+        <w:t>The deposited datasets and versioned analysis outputs supporting this study are available in the Zenodo repository at https://doi.org/10.5281/zenodo.23461089 [41]. The repository records the distinct 3,192- and 3,526-genome scopes and includes accession-resolved inputs where they were preserved. Protein sequences for all 13,237 catalog members were recovered from versioned NCBI assembly protein FASTA files, with five accessions recovered through NCBI Protein; URLs, retrieval dates and checksums are deposited with the sequence file. Supplementary Table S2 defines the scope of each principal data artifact. The complete 1,069-genome candidate pool, raw discovery HMM hit tables, corrected 3,526-genome raw matrices and several dependence-corrected source tables remain unavailable; claims that require those artifacts are limited accordingly. Third-party database records and recovered sequences remain subject to their source terms.</w:t>
       </w:r>
     </w:p>
     <w:p>
@@ -1974,7 +1968,7 @@
         <w:rPr>
           <w:rFonts w:ascii="Arial" w:hAnsi="Arial"/>
         </w:rPr>
-        <w:t>Custom code, automated tests, locked software environments, a container recipe, checksums and a worked example are available under the MIT License at https://github.com/ajayvellanki0720-boop/archaeal-dbd-catalog and in the immutable version 0.4.0 archive at https://doi.org/10.5281/zenodo.23461090 [41]. The portable analyses require Python 3.12; external-tool versions are pinned in environment.yml.</w:t>
+        <w:t>Custom code, automated tests, locked software environments, a container recipe, checksums and a worked example are available under the MIT License at https://github.com/ajayvellanki0720-boop/archaeal-dbd-catalog and in the immutable version 0.5.0 archive at https://doi.org/10.5281/zenodo.23461089 [41]. The portable analyses require Python 3.12; external-tool versions are pinned in environment.yml.</w:t>
       </w:r>
     </w:p>
     <w:p>
@@ -3781,7 +3775,7 @@
         <w:rPr>
           <w:rFonts w:ascii="Arial" w:hAnsi="Arial"/>
         </w:rPr>
-        <w:t xml:space="preserve">Archaeal DBD catalog: reproducibility package (version 0.4.0). </w:t>
+        <w:t xml:space="preserve">Archaeal DBD catalog: reproducibility package (version 0.5.0). </w:t>
       </w:r>
       <w:r>
         <w:rPr>
@@ -3794,7 +3788,7 @@
         <w:rPr>
           <w:rFonts w:ascii="Arial" w:hAnsi="Arial"/>
         </w:rPr>
-        <w:t xml:space="preserve"> https://doi.org/10.5281/zenodo.23461090 (2026).</w:t>
+        <w:t xml:space="preserve"> https://doi.org/10.5281/zenodo.23461089 (2026).</w:t>
       </w:r>
     </w:p>
     <w:p>

</xml_diff>